<commit_message>
Serie 3: nuevos diagramas sagitales y cambiar recta vertical por hipérbola
Co-Authored-By: Claude Opus 5.5 <noreply@anthropic.com>
Claude-Session: https://claude.ai/code/session_01UPgBK7ija5P9sp4CepPZaP
</commit_message>
<xml_diff>
--- a/matematicas-3/materiales/Serie3_Definicion_de_Funciones.docx
+++ b/matematicas-3/materiales/Serie3_Definicion_de_Funciones.docx
@@ -887,7 +887,7 @@
             <w:r>
               <w:drawing>
                 <wp:inline distT="0" distB="0" distL="0" distR="0">
-                  <wp:extent cx="1809750" cy="1323975"/>
+                  <wp:extent cx="1809750" cy="1457325"/>
                   <wp:effectExtent t="0" r="0" b="0" l="0"/>
                   <wp:docPr id="1" name="" descr="" title=""/>
                   <wp:cNvGraphicFramePr>
@@ -912,7 +912,7 @@
                         <pic:spPr bwMode="auto">
                           <a:xfrm>
                             <a:off x="0" y="0"/>
-                            <a:ext cx="1809750" cy="1323975"/>
+                            <a:ext cx="1809750" cy="1457325"/>
                           </a:xfrm>
                           <a:prstGeom prst="rect">
                             <a:avLst/>
@@ -950,7 +950,7 @@
             <w:r>
               <w:drawing>
                 <wp:inline distT="0" distB="0" distL="0" distR="0">
-                  <wp:extent cx="1809750" cy="1323975"/>
+                  <wp:extent cx="1809750" cy="1457325"/>
                   <wp:effectExtent t="0" r="0" b="0" l="0"/>
                   <wp:docPr id="1" name="" descr="" title=""/>
                   <wp:cNvGraphicFramePr>
@@ -975,7 +975,7 @@
                         <pic:spPr bwMode="auto">
                           <a:xfrm>
                             <a:off x="0" y="0"/>
-                            <a:ext cx="1809750" cy="1323975"/>
+                            <a:ext cx="1809750" cy="1457325"/>
                           </a:xfrm>
                           <a:prstGeom prst="rect">
                             <a:avLst/>
@@ -1018,7 +1018,7 @@
             <w:r>
               <w:drawing>
                 <wp:inline distT="0" distB="0" distL="0" distR="0">
-                  <wp:extent cx="1809750" cy="1323975"/>
+                  <wp:extent cx="1809750" cy="1457325"/>
                   <wp:effectExtent t="0" r="0" b="0" l="0"/>
                   <wp:docPr id="1" name="" descr="" title=""/>
                   <wp:cNvGraphicFramePr>
@@ -1043,7 +1043,7 @@
                         <pic:spPr bwMode="auto">
                           <a:xfrm>
                             <a:off x="0" y="0"/>
-                            <a:ext cx="1809750" cy="1323975"/>
+                            <a:ext cx="1809750" cy="1457325"/>
                           </a:xfrm>
                           <a:prstGeom prst="rect">
                             <a:avLst/>
@@ -1081,7 +1081,7 @@
             <w:r>
               <w:drawing>
                 <wp:inline distT="0" distB="0" distL="0" distR="0">
-                  <wp:extent cx="1809750" cy="1323975"/>
+                  <wp:extent cx="1809750" cy="1457325"/>
                   <wp:effectExtent t="0" r="0" b="0" l="0"/>
                   <wp:docPr id="1" name="" descr="" title=""/>
                   <wp:cNvGraphicFramePr>
@@ -1106,7 +1106,7 @@
                         <pic:spPr bwMode="auto">
                           <a:xfrm>
                             <a:off x="0" y="0"/>
-                            <a:ext cx="1809750" cy="1323975"/>
+                            <a:ext cx="1809750" cy="1457325"/>
                           </a:xfrm>
                           <a:prstGeom prst="rect">
                             <a:avLst/>
@@ -2705,7 +2705,7 @@
                 <w:sz w:val="17"/>
                 <w:szCs w:val="17"/>
               </w:rPr>
-              <w:t xml:space="preserve">Aplica la prueba de forma parcial o con dificultad en gráficas menos comunes (como la parábola acostada o la recta vertical).</w:t>
+              <w:t xml:space="preserve">Aplica la prueba de forma parcial o con dificultad en gráficas menos comunes (como la parábola acostada o la hipérbola).</w:t>
             </w:r>
           </w:p>
         </w:tc>

</xml_diff>